<commit_message>
docs: update task 3 submission report document with srs, diagrams and api list
</commit_message>
<xml_diff>
--- a/Task 03_23102A0025.docx
+++ b/Task 03_23102A0025.docx
@@ -266,26 +266,20 @@
         <w:jc w:val="both"/>
         <w:rPr>
           <w:rFonts w:ascii="Segoe UI" w:hAnsi="Segoe UI" w:cs="Segoe UI"/>
+          <w:b/>
+          <w:bCs/>
           <w:lang w:val="en-US"/>
         </w:rPr>
       </w:pPr>
       <w:r>
         <w:rPr>
           <w:rFonts w:ascii="Segoe UI" w:hAnsi="Segoe UI" w:cs="Segoe UI"/>
+          <w:b/>
+          <w:bCs/>
           <w:lang w:val="en-US"/>
         </w:rPr>
         <w:t xml:space="preserve">Technology Stack </w:t>
       </w:r>
-    </w:p>
-    <w:p>
-      <w:pPr>
-        <w:pStyle w:val="ListParagraph"/>
-        <w:jc w:val="both"/>
-        <w:rPr>
-          <w:rFonts w:ascii="Segoe UI" w:hAnsi="Segoe UI" w:cs="Segoe UI"/>
-          <w:lang w:val="en-US"/>
-        </w:rPr>
-      </w:pPr>
     </w:p>
     <w:tbl>
       <w:tblPr>
@@ -802,7 +796,21 @@
               <w:rPr>
                 <w:rFonts w:ascii="Segoe UI" w:hAnsi="Segoe UI" w:cs="Segoe UI"/>
               </w:rPr>
-              <w:t>App is built as a WAR and dropped into Tomcat's webapps/ , matching Task 8's explicit Tomcat/Nginx choice</w:t>
+              <w:t>App is built as a WAR and dropped into Tomcat's webapps</w:t>
+            </w:r>
+            <w:proofErr w:type="gramStart"/>
+            <w:r>
+              <w:rPr>
+                <w:rFonts w:ascii="Segoe UI" w:hAnsi="Segoe UI" w:cs="Segoe UI"/>
+              </w:rPr>
+              <w:t>/ ,</w:t>
+            </w:r>
+            <w:proofErr w:type="gramEnd"/>
+            <w:r>
+              <w:rPr>
+                <w:rFonts w:ascii="Segoe UI" w:hAnsi="Segoe UI" w:cs="Segoe UI"/>
+              </w:rPr>
+              <w:t xml:space="preserve"> matching Task 8's explicit Tomcat/Nginx choice</w:t>
             </w:r>
           </w:p>
         </w:tc>
@@ -849,7 +857,14 @@
               <w:rPr>
                 <w:rFonts w:ascii="Segoe UI" w:hAnsi="Segoe UI" w:cs="Segoe UI"/>
               </w:rPr>
-              <w:t xml:space="preserve">Selenium WebDriver + JUnit, run via Maven ( </w:t>
+              <w:t xml:space="preserve">Selenium WebDriver + JUnit, run via Maven </w:t>
+            </w:r>
+            <w:proofErr w:type="gramStart"/>
+            <w:r>
+              <w:rPr>
+                <w:rFonts w:ascii="Segoe UI" w:hAnsi="Segoe UI" w:cs="Segoe UI"/>
+              </w:rPr>
+              <w:t xml:space="preserve">( </w:t>
             </w:r>
             <w:proofErr w:type="spellStart"/>
             <w:r>
@@ -859,12 +874,21 @@
               <w:t>mvn</w:t>
             </w:r>
             <w:proofErr w:type="spellEnd"/>
-            <w:r>
-              <w:rPr>
-                <w:rFonts w:ascii="Segoe UI" w:hAnsi="Segoe UI" w:cs="Segoe UI"/>
-              </w:rPr>
-              <w:t xml:space="preserve"> test )</w:t>
-            </w:r>
+            <w:proofErr w:type="gramEnd"/>
+            <w:r>
+              <w:rPr>
+                <w:rFonts w:ascii="Segoe UI" w:hAnsi="Segoe UI" w:cs="Segoe UI"/>
+              </w:rPr>
+              <w:t xml:space="preserve"> </w:t>
+            </w:r>
+            <w:proofErr w:type="gramStart"/>
+            <w:r>
+              <w:rPr>
+                <w:rFonts w:ascii="Segoe UI" w:hAnsi="Segoe UI" w:cs="Segoe UI"/>
+              </w:rPr>
+              <w:t>test )</w:t>
+            </w:r>
+            <w:proofErr w:type="gramEnd"/>
           </w:p>
         </w:tc>
         <w:tc>
@@ -1164,26 +1188,20 @@
         <w:jc w:val="both"/>
         <w:rPr>
           <w:rFonts w:ascii="Segoe UI" w:hAnsi="Segoe UI" w:cs="Segoe UI"/>
+          <w:b/>
+          <w:bCs/>
           <w:lang w:val="en-US"/>
         </w:rPr>
       </w:pPr>
       <w:r>
         <w:rPr>
           <w:rFonts w:ascii="Segoe UI" w:hAnsi="Segoe UI" w:cs="Segoe UI"/>
+          <w:b/>
+          <w:bCs/>
           <w:lang w:val="en-US"/>
         </w:rPr>
         <w:t>Software Requirements Summary (SRS)</w:t>
       </w:r>
-    </w:p>
-    <w:p>
-      <w:pPr>
-        <w:pStyle w:val="ListParagraph"/>
-        <w:jc w:val="both"/>
-        <w:rPr>
-          <w:rFonts w:ascii="Segoe UI" w:hAnsi="Segoe UI" w:cs="Segoe UI"/>
-          <w:lang w:val="en-US"/>
-        </w:rPr>
-      </w:pPr>
     </w:p>
     <w:p>
       <w:pPr>
@@ -1195,12 +1213,16 @@
         <w:jc w:val="both"/>
         <w:rPr>
           <w:rFonts w:ascii="Segoe UI" w:hAnsi="Segoe UI" w:cs="Segoe UI"/>
+          <w:b/>
+          <w:bCs/>
           <w:lang w:val="en-US"/>
         </w:rPr>
       </w:pPr>
       <w:r>
         <w:rPr>
           <w:rFonts w:ascii="Segoe UI" w:hAnsi="Segoe UI" w:cs="Segoe UI"/>
+          <w:b/>
+          <w:bCs/>
           <w:lang w:val="en-US"/>
         </w:rPr>
         <w:t>Purpose</w:t>
@@ -1257,12 +1279,16 @@
         <w:jc w:val="both"/>
         <w:rPr>
           <w:rFonts w:ascii="Segoe UI" w:hAnsi="Segoe UI" w:cs="Segoe UI"/>
+          <w:b/>
+          <w:bCs/>
           <w:lang w:val="en-US"/>
         </w:rPr>
       </w:pPr>
       <w:r>
         <w:rPr>
           <w:rFonts w:ascii="Segoe UI" w:hAnsi="Segoe UI" w:cs="Segoe UI"/>
+          <w:b/>
+          <w:bCs/>
           <w:lang w:val="en-US"/>
         </w:rPr>
         <w:t>Scope</w:t>
@@ -1476,27 +1502,20 @@
         <w:jc w:val="both"/>
         <w:rPr>
           <w:rFonts w:ascii="Segoe UI" w:hAnsi="Segoe UI" w:cs="Segoe UI"/>
+          <w:b/>
+          <w:bCs/>
           <w:lang w:val="en-US"/>
         </w:rPr>
       </w:pPr>
       <w:r>
         <w:rPr>
           <w:rFonts w:ascii="Segoe UI" w:hAnsi="Segoe UI" w:cs="Segoe UI"/>
+          <w:b/>
+          <w:bCs/>
           <w:lang w:val="en-US"/>
         </w:rPr>
         <w:t>User Classes</w:t>
       </w:r>
-    </w:p>
-    <w:p>
-      <w:pPr>
-        <w:pStyle w:val="ListParagraph"/>
-        <w:ind w:left="1080"/>
-        <w:jc w:val="both"/>
-        <w:rPr>
-          <w:rFonts w:ascii="Segoe UI" w:hAnsi="Segoe UI" w:cs="Segoe UI"/>
-          <w:lang w:val="en-US"/>
-        </w:rPr>
-      </w:pPr>
     </w:p>
     <w:tbl>
       <w:tblPr>
@@ -1836,12 +1855,16 @@
         <w:jc w:val="both"/>
         <w:rPr>
           <w:rFonts w:ascii="Segoe UI" w:hAnsi="Segoe UI" w:cs="Segoe UI"/>
+          <w:b/>
+          <w:bCs/>
           <w:lang w:val="en-US"/>
         </w:rPr>
       </w:pPr>
       <w:r>
         <w:rPr>
           <w:rFonts w:ascii="Segoe UI" w:hAnsi="Segoe UI" w:cs="Segoe UI"/>
+          <w:b/>
+          <w:bCs/>
           <w:lang w:val="en-US"/>
         </w:rPr>
         <w:t xml:space="preserve">2.4 </w:t>
@@ -1849,21 +1872,12 @@
       <w:r>
         <w:rPr>
           <w:rFonts w:ascii="Segoe UI" w:hAnsi="Segoe UI" w:cs="Segoe UI"/>
+          <w:b/>
+          <w:bCs/>
           <w:lang w:val="en-US"/>
         </w:rPr>
         <w:t>Functional Requirements</w:t>
       </w:r>
-    </w:p>
-    <w:p>
-      <w:pPr>
-        <w:pStyle w:val="ListParagraph"/>
-        <w:ind w:left="1080"/>
-        <w:jc w:val="both"/>
-        <w:rPr>
-          <w:rFonts w:ascii="Segoe UI" w:hAnsi="Segoe UI" w:cs="Segoe UI"/>
-          <w:lang w:val="en-US"/>
-        </w:rPr>
-      </w:pPr>
     </w:p>
     <w:tbl>
       <w:tblPr>
@@ -2166,7 +2180,6 @@
                 <w:rFonts w:ascii="Segoe UI" w:hAnsi="Segoe UI" w:cs="Segoe UI"/>
                 <w:lang w:val="en-US"/>
               </w:rPr>
-              <w:lastRenderedPageBreak/>
               <w:t>FR5</w:t>
             </w:r>
           </w:p>
@@ -2261,6 +2274,7 @@
                 <w:rFonts w:ascii="Segoe UI" w:hAnsi="Segoe UI" w:cs="Segoe UI"/>
                 <w:lang w:val="en-US"/>
               </w:rPr>
+              <w:lastRenderedPageBreak/>
               <w:t>FR7</w:t>
             </w:r>
           </w:p>
@@ -2530,27 +2544,20 @@
         <w:jc w:val="both"/>
         <w:rPr>
           <w:rFonts w:ascii="Segoe UI" w:hAnsi="Segoe UI" w:cs="Segoe UI"/>
+          <w:b/>
+          <w:bCs/>
           <w:lang w:val="en-US"/>
         </w:rPr>
       </w:pPr>
       <w:r>
         <w:rPr>
           <w:rFonts w:ascii="Segoe UI" w:hAnsi="Segoe UI" w:cs="Segoe UI"/>
+          <w:b/>
+          <w:bCs/>
           <w:lang w:val="en-US"/>
         </w:rPr>
         <w:t>Non-Functional Requirements</w:t>
       </w:r>
-    </w:p>
-    <w:p>
-      <w:pPr>
-        <w:pStyle w:val="ListParagraph"/>
-        <w:ind w:left="1080"/>
-        <w:jc w:val="both"/>
-        <w:rPr>
-          <w:rFonts w:ascii="Segoe UI" w:hAnsi="Segoe UI" w:cs="Segoe UI"/>
-          <w:lang w:val="en-US"/>
-        </w:rPr>
-      </w:pPr>
     </w:p>
     <w:tbl>
       <w:tblPr>
@@ -2969,16 +2976,105 @@
         <w:jc w:val="both"/>
         <w:rPr>
           <w:rFonts w:ascii="Segoe UI" w:hAnsi="Segoe UI" w:cs="Segoe UI"/>
+          <w:b/>
+          <w:bCs/>
           <w:lang w:val="en-US"/>
         </w:rPr>
       </w:pPr>
       <w:r>
+        <w:rPr>
+          <w:rFonts w:ascii="Segoe UI" w:hAnsi="Segoe UI" w:cs="Segoe UI"/>
+          <w:b/>
+          <w:bCs/>
+          <w:lang w:val="en-US"/>
+        </w:rPr>
+        <w:t>Use-Case Diagram</w:t>
+      </w:r>
+    </w:p>
+    <w:p>
+      <w:pPr>
+        <w:pStyle w:val="ListParagraph"/>
+        <w:ind w:left="360"/>
+        <w:jc w:val="both"/>
         <w:rPr>
           <w:rFonts w:ascii="Segoe UI" w:hAnsi="Segoe UI" w:cs="Segoe UI"/>
           <w:lang w:val="en-US"/>
         </w:rPr>
-        <w:t>Use-Case Diagram</w:t>
+      </w:pPr>
+    </w:p>
+    <w:p>
+      <w:pPr>
+        <w:pStyle w:val="ListParagraph"/>
+        <w:ind w:left="360"/>
+        <w:jc w:val="center"/>
+        <w:rPr>
+          <w:rFonts w:ascii="Segoe UI" w:hAnsi="Segoe UI" w:cs="Segoe UI"/>
+        </w:rPr>
+      </w:pPr>
+      <w:r>
+        <w:rPr>
+          <w:rFonts w:ascii="Segoe UI" w:hAnsi="Segoe UI" w:cs="Segoe UI"/>
+        </w:rPr>
+        <w:drawing>
+          <wp:inline distT="0" distB="0" distL="0" distR="0" wp14:anchorId="0E56F05E" wp14:editId="72BB68DC">
+            <wp:extent cx="4226651" cy="3817620"/>
+            <wp:effectExtent l="0" t="0" r="2540" b="0"/>
+            <wp:docPr id="182416585" name="Picture 3"/>
+            <wp:cNvGraphicFramePr>
+              <a:graphicFrameLocks xmlns:a="http://schemas.openxmlformats.org/drawingml/2006/main" noChangeAspect="1"/>
+            </wp:cNvGraphicFramePr>
+            <a:graphic xmlns:a="http://schemas.openxmlformats.org/drawingml/2006/main">
+              <a:graphicData uri="http://schemas.openxmlformats.org/drawingml/2006/picture">
+                <pic:pic xmlns:pic="http://schemas.openxmlformats.org/drawingml/2006/picture">
+                  <pic:nvPicPr>
+                    <pic:cNvPr id="0" name="Picture 11"/>
+                    <pic:cNvPicPr>
+                      <a:picLocks noChangeAspect="1" noChangeArrowheads="1"/>
+                    </pic:cNvPicPr>
+                  </pic:nvPicPr>
+                  <pic:blipFill>
+                    <a:blip r:embed="rId10">
+                      <a:extLst>
+                        <a:ext uri="{28A0092B-C50C-407E-A947-70E740481C1C}">
+                          <a14:useLocalDpi xmlns:a14="http://schemas.microsoft.com/office/drawing/2010/main" val="0"/>
+                        </a:ext>
+                      </a:extLst>
+                    </a:blip>
+                    <a:srcRect/>
+                    <a:stretch>
+                      <a:fillRect/>
+                    </a:stretch>
+                  </pic:blipFill>
+                  <pic:spPr bwMode="auto">
+                    <a:xfrm>
+                      <a:off x="0" y="0"/>
+                      <a:ext cx="4293234" cy="3877760"/>
+                    </a:xfrm>
+                    <a:prstGeom prst="rect">
+                      <a:avLst/>
+                    </a:prstGeom>
+                    <a:noFill/>
+                    <a:ln>
+                      <a:noFill/>
+                    </a:ln>
+                  </pic:spPr>
+                </pic:pic>
+              </a:graphicData>
+            </a:graphic>
+          </wp:inline>
+        </w:drawing>
       </w:r>
+    </w:p>
+    <w:p>
+      <w:pPr>
+        <w:pStyle w:val="ListParagraph"/>
+        <w:ind w:left="360"/>
+        <w:jc w:val="both"/>
+        <w:rPr>
+          <w:rFonts w:ascii="Segoe UI" w:hAnsi="Segoe UI" w:cs="Segoe UI"/>
+          <w:lang w:val="en-US"/>
+        </w:rPr>
+      </w:pPr>
     </w:p>
     <w:p>
       <w:pPr>
@@ -2990,16 +3086,124 @@
         <w:jc w:val="both"/>
         <w:rPr>
           <w:rFonts w:ascii="Segoe UI" w:hAnsi="Segoe UI" w:cs="Segoe UI"/>
+          <w:b/>
+          <w:bCs/>
           <w:lang w:val="en-US"/>
         </w:rPr>
       </w:pPr>
       <w:r>
         <w:rPr>
           <w:rFonts w:ascii="Segoe UI" w:hAnsi="Segoe UI" w:cs="Segoe UI"/>
+          <w:b/>
+          <w:bCs/>
           <w:lang w:val="en-US"/>
         </w:rPr>
         <w:t>Application Architecture</w:t>
       </w:r>
+    </w:p>
+    <w:p>
+      <w:pPr>
+        <w:pStyle w:val="ListParagraph"/>
+        <w:ind w:left="360"/>
+        <w:jc w:val="both"/>
+        <w:rPr>
+          <w:rFonts w:ascii="Segoe UI" w:hAnsi="Segoe UI" w:cs="Segoe UI"/>
+          <w:b/>
+          <w:bCs/>
+          <w:lang w:val="en-US"/>
+        </w:rPr>
+      </w:pPr>
+    </w:p>
+    <w:p>
+      <w:pPr>
+        <w:pStyle w:val="ListParagraph"/>
+        <w:ind w:left="360"/>
+        <w:jc w:val="center"/>
+        <w:rPr>
+          <w:rFonts w:ascii="Segoe UI" w:hAnsi="Segoe UI" w:cs="Segoe UI"/>
+          <w:b/>
+          <w:bCs/>
+        </w:rPr>
+      </w:pPr>
+      <w:r>
+        <w:rPr>
+          <w:rFonts w:ascii="Segoe UI" w:hAnsi="Segoe UI" w:cs="Segoe UI"/>
+          <w:b/>
+          <w:bCs/>
+        </w:rPr>
+        <w:drawing>
+          <wp:inline distT="0" distB="0" distL="0" distR="0" wp14:anchorId="7E7CE2DF" wp14:editId="606311ED">
+            <wp:extent cx="5984592" cy="1656272"/>
+            <wp:effectExtent l="0" t="0" r="0" b="1270"/>
+            <wp:docPr id="87965301" name="Picture 6"/>
+            <wp:cNvGraphicFramePr>
+              <a:graphicFrameLocks xmlns:a="http://schemas.openxmlformats.org/drawingml/2006/main" noChangeAspect="1"/>
+            </wp:cNvGraphicFramePr>
+            <a:graphic xmlns:a="http://schemas.openxmlformats.org/drawingml/2006/main">
+              <a:graphicData uri="http://schemas.openxmlformats.org/drawingml/2006/picture">
+                <pic:pic xmlns:pic="http://schemas.openxmlformats.org/drawingml/2006/picture">
+                  <pic:nvPicPr>
+                    <pic:cNvPr id="0" name="Picture 23"/>
+                    <pic:cNvPicPr>
+                      <a:picLocks noChangeAspect="1" noChangeArrowheads="1"/>
+                    </pic:cNvPicPr>
+                  </pic:nvPicPr>
+                  <pic:blipFill>
+                    <a:blip r:embed="rId11">
+                      <a:extLst>
+                        <a:ext uri="{28A0092B-C50C-407E-A947-70E740481C1C}">
+                          <a14:useLocalDpi xmlns:a14="http://schemas.microsoft.com/office/drawing/2010/main" val="0"/>
+                        </a:ext>
+                      </a:extLst>
+                    </a:blip>
+                    <a:srcRect/>
+                    <a:stretch>
+                      <a:fillRect/>
+                    </a:stretch>
+                  </pic:blipFill>
+                  <pic:spPr bwMode="auto">
+                    <a:xfrm>
+                      <a:off x="0" y="0"/>
+                      <a:ext cx="5993641" cy="1658776"/>
+                    </a:xfrm>
+                    <a:prstGeom prst="rect">
+                      <a:avLst/>
+                    </a:prstGeom>
+                    <a:noFill/>
+                    <a:ln>
+                      <a:noFill/>
+                    </a:ln>
+                  </pic:spPr>
+                </pic:pic>
+              </a:graphicData>
+            </a:graphic>
+          </wp:inline>
+        </w:drawing>
+      </w:r>
+    </w:p>
+    <w:p>
+      <w:pPr>
+        <w:pStyle w:val="ListParagraph"/>
+        <w:ind w:left="360"/>
+        <w:jc w:val="both"/>
+        <w:rPr>
+          <w:rFonts w:ascii="Segoe UI" w:hAnsi="Segoe UI" w:cs="Segoe UI"/>
+          <w:b/>
+          <w:bCs/>
+          <w:lang w:val="en-US"/>
+        </w:rPr>
+      </w:pPr>
+    </w:p>
+    <w:p>
+      <w:pPr>
+        <w:jc w:val="both"/>
+        <w:rPr>
+          <w:rFonts w:ascii="Segoe UI" w:hAnsi="Segoe UI" w:cs="Segoe UI"/>
+          <w:b/>
+          <w:bCs/>
+          <w:lang w:val="en-US"/>
+        </w:rPr>
+      </w:pPr>
     </w:p>
     <w:p>
       <w:pPr>
@@ -3011,16 +3215,89 @@
         <w:jc w:val="both"/>
         <w:rPr>
           <w:rFonts w:ascii="Segoe UI" w:hAnsi="Segoe UI" w:cs="Segoe UI"/>
+          <w:b/>
+          <w:bCs/>
           <w:lang w:val="en-US"/>
         </w:rPr>
       </w:pPr>
       <w:r>
         <w:rPr>
           <w:rFonts w:ascii="Segoe UI" w:hAnsi="Segoe UI" w:cs="Segoe UI"/>
+          <w:b/>
+          <w:bCs/>
           <w:lang w:val="en-US"/>
         </w:rPr>
         <w:t>Data Model (ER Diagram)</w:t>
       </w:r>
+    </w:p>
+    <w:p>
+      <w:pPr>
+        <w:pStyle w:val="ListParagraph"/>
+        <w:ind w:left="360"/>
+        <w:jc w:val="both"/>
+        <w:rPr>
+          <w:rFonts w:ascii="Segoe UI" w:hAnsi="Segoe UI" w:cs="Segoe UI"/>
+          <w:b/>
+          <w:bCs/>
+          <w:lang w:val="en-US"/>
+        </w:rPr>
+      </w:pPr>
+      <w:r>
+        <w:rPr>
+          <w:rFonts w:ascii="Segoe UI" w:hAnsi="Segoe UI" w:cs="Segoe UI"/>
+          <w:b/>
+          <w:bCs/>
+          <w:lang w:val="en-US"/>
+        </w:rPr>
+        <w:drawing>
+          <wp:inline distT="0" distB="0" distL="0" distR="0" wp14:anchorId="1764D644" wp14:editId="62C0F770">
+            <wp:extent cx="5731510" cy="4147185"/>
+            <wp:effectExtent l="0" t="0" r="2540" b="5715"/>
+            <wp:docPr id="1450612936" name="Picture 1"/>
+            <wp:cNvGraphicFramePr>
+              <a:graphicFrameLocks xmlns:a="http://schemas.openxmlformats.org/drawingml/2006/main" noChangeAspect="1"/>
+            </wp:cNvGraphicFramePr>
+            <a:graphic xmlns:a="http://schemas.openxmlformats.org/drawingml/2006/main">
+              <a:graphicData uri="http://schemas.openxmlformats.org/drawingml/2006/picture">
+                <pic:pic xmlns:pic="http://schemas.openxmlformats.org/drawingml/2006/picture">
+                  <pic:nvPicPr>
+                    <pic:cNvPr id="1450612936" name=""/>
+                    <pic:cNvPicPr/>
+                  </pic:nvPicPr>
+                  <pic:blipFill>
+                    <a:blip r:embed="rId12"/>
+                    <a:stretch>
+                      <a:fillRect/>
+                    </a:stretch>
+                  </pic:blipFill>
+                  <pic:spPr>
+                    <a:xfrm>
+                      <a:off x="0" y="0"/>
+                      <a:ext cx="5731510" cy="4147185"/>
+                    </a:xfrm>
+                    <a:prstGeom prst="rect">
+                      <a:avLst/>
+                    </a:prstGeom>
+                  </pic:spPr>
+                </pic:pic>
+              </a:graphicData>
+            </a:graphic>
+          </wp:inline>
+        </w:drawing>
+      </w:r>
+    </w:p>
+    <w:p>
+      <w:pPr>
+        <w:pStyle w:val="ListParagraph"/>
+        <w:ind w:left="360"/>
+        <w:jc w:val="both"/>
+        <w:rPr>
+          <w:rFonts w:ascii="Segoe UI" w:hAnsi="Segoe UI" w:cs="Segoe UI"/>
+          <w:b/>
+          <w:bCs/>
+          <w:lang w:val="en-US"/>
+        </w:rPr>
+      </w:pPr>
     </w:p>
     <w:p>
       <w:pPr>
@@ -3032,16 +3309,1147 @@
         <w:jc w:val="both"/>
         <w:rPr>
           <w:rFonts w:ascii="Segoe UI" w:hAnsi="Segoe UI" w:cs="Segoe UI"/>
+          <w:b/>
+          <w:bCs/>
           <w:lang w:val="en-US"/>
         </w:rPr>
       </w:pPr>
       <w:r>
         <w:rPr>
           <w:rFonts w:ascii="Segoe UI" w:hAnsi="Segoe UI" w:cs="Segoe UI"/>
+          <w:b/>
+          <w:bCs/>
           <w:lang w:val="en-US"/>
         </w:rPr>
         <w:t>API List</w:t>
       </w:r>
+    </w:p>
+    <w:tbl>
+      <w:tblPr>
+        <w:tblStyle w:val="TableGrid"/>
+        <w:tblW w:w="0" w:type="auto"/>
+        <w:tblInd w:w="360" w:type="dxa"/>
+        <w:tblLook w:val="04A0" w:firstRow="1" w:lastRow="0" w:firstColumn="1" w:lastColumn="0" w:noHBand="0" w:noVBand="1"/>
+      </w:tblPr>
+      <w:tblGrid>
+        <w:gridCol w:w="1193"/>
+        <w:gridCol w:w="2408"/>
+        <w:gridCol w:w="2948"/>
+        <w:gridCol w:w="2087"/>
+      </w:tblGrid>
+      <w:tr>
+        <w:tc>
+          <w:tcPr>
+            <w:tcW w:w="1195" w:type="dxa"/>
+            <w:tcBorders>
+              <w:top w:val="double" w:sz="4" w:space="0" w:color="A5AB81" w:themeColor="accent3"/>
+              <w:left w:val="double" w:sz="4" w:space="0" w:color="A5AB81" w:themeColor="accent3"/>
+              <w:bottom w:val="double" w:sz="4" w:space="0" w:color="A5AB81" w:themeColor="accent3"/>
+              <w:right w:val="double" w:sz="4" w:space="0" w:color="A5AB81" w:themeColor="accent3"/>
+            </w:tcBorders>
+            <w:shd w:val="clear" w:color="auto" w:fill="80865A" w:themeFill="accent3" w:themeFillShade="BF"/>
+          </w:tcPr>
+          <w:p>
+            <w:pPr>
+              <w:pStyle w:val="ListParagraph"/>
+              <w:ind w:left="0"/>
+              <w:jc w:val="both"/>
+              <w:rPr>
+                <w:rFonts w:ascii="Segoe UI" w:hAnsi="Segoe UI" w:cs="Segoe UI"/>
+                <w:b/>
+                <w:bCs/>
+                <w:lang w:val="en-US"/>
+              </w:rPr>
+            </w:pPr>
+            <w:r>
+              <w:rPr>
+                <w:rFonts w:ascii="Segoe UI" w:hAnsi="Segoe UI" w:cs="Segoe UI"/>
+                <w:b/>
+                <w:bCs/>
+                <w:lang w:val="en-US"/>
+              </w:rPr>
+              <w:t>Method</w:t>
+            </w:r>
+          </w:p>
+        </w:tc>
+        <w:tc>
+          <w:tcPr>
+            <w:tcW w:w="2409" w:type="dxa"/>
+            <w:tcBorders>
+              <w:top w:val="double" w:sz="4" w:space="0" w:color="A5AB81" w:themeColor="accent3"/>
+              <w:left w:val="double" w:sz="4" w:space="0" w:color="A5AB81" w:themeColor="accent3"/>
+              <w:bottom w:val="double" w:sz="4" w:space="0" w:color="A5AB81" w:themeColor="accent3"/>
+              <w:right w:val="double" w:sz="4" w:space="0" w:color="A5AB81" w:themeColor="accent3"/>
+            </w:tcBorders>
+            <w:shd w:val="clear" w:color="auto" w:fill="80865A" w:themeFill="accent3" w:themeFillShade="BF"/>
+          </w:tcPr>
+          <w:p>
+            <w:pPr>
+              <w:pStyle w:val="ListParagraph"/>
+              <w:ind w:left="0"/>
+              <w:jc w:val="both"/>
+              <w:rPr>
+                <w:rFonts w:ascii="Segoe UI" w:hAnsi="Segoe UI" w:cs="Segoe UI"/>
+                <w:b/>
+                <w:bCs/>
+                <w:lang w:val="en-US"/>
+              </w:rPr>
+            </w:pPr>
+            <w:r>
+              <w:rPr>
+                <w:rFonts w:ascii="Segoe UI" w:hAnsi="Segoe UI" w:cs="Segoe UI"/>
+                <w:b/>
+                <w:bCs/>
+                <w:lang w:val="en-US"/>
+              </w:rPr>
+              <w:t>Endpoint</w:t>
+            </w:r>
+          </w:p>
+        </w:tc>
+        <w:tc>
+          <w:tcPr>
+            <w:tcW w:w="2958" w:type="dxa"/>
+            <w:tcBorders>
+              <w:top w:val="double" w:sz="4" w:space="0" w:color="A5AB81" w:themeColor="accent3"/>
+              <w:left w:val="double" w:sz="4" w:space="0" w:color="A5AB81" w:themeColor="accent3"/>
+              <w:bottom w:val="double" w:sz="4" w:space="0" w:color="A5AB81" w:themeColor="accent3"/>
+              <w:right w:val="double" w:sz="4" w:space="0" w:color="A5AB81" w:themeColor="accent3"/>
+            </w:tcBorders>
+            <w:shd w:val="clear" w:color="auto" w:fill="80865A" w:themeFill="accent3" w:themeFillShade="BF"/>
+          </w:tcPr>
+          <w:p>
+            <w:pPr>
+              <w:pStyle w:val="ListParagraph"/>
+              <w:ind w:left="0"/>
+              <w:jc w:val="both"/>
+              <w:rPr>
+                <w:rFonts w:ascii="Segoe UI" w:hAnsi="Segoe UI" w:cs="Segoe UI"/>
+                <w:b/>
+                <w:bCs/>
+                <w:lang w:val="en-US"/>
+              </w:rPr>
+            </w:pPr>
+            <w:r>
+              <w:rPr>
+                <w:rFonts w:ascii="Segoe UI" w:hAnsi="Segoe UI" w:cs="Segoe UI"/>
+                <w:b/>
+                <w:bCs/>
+                <w:lang w:val="en-US"/>
+              </w:rPr>
+              <w:t>Purpose</w:t>
+            </w:r>
+          </w:p>
+        </w:tc>
+        <w:tc>
+          <w:tcPr>
+            <w:tcW w:w="2094" w:type="dxa"/>
+            <w:tcBorders>
+              <w:top w:val="double" w:sz="4" w:space="0" w:color="A5AB81" w:themeColor="accent3"/>
+              <w:left w:val="double" w:sz="4" w:space="0" w:color="A5AB81" w:themeColor="accent3"/>
+              <w:bottom w:val="double" w:sz="4" w:space="0" w:color="A5AB81" w:themeColor="accent3"/>
+              <w:right w:val="double" w:sz="4" w:space="0" w:color="A5AB81" w:themeColor="accent3"/>
+            </w:tcBorders>
+            <w:shd w:val="clear" w:color="auto" w:fill="80865A" w:themeFill="accent3" w:themeFillShade="BF"/>
+          </w:tcPr>
+          <w:p>
+            <w:pPr>
+              <w:pStyle w:val="ListParagraph"/>
+              <w:ind w:left="0"/>
+              <w:jc w:val="both"/>
+              <w:rPr>
+                <w:rFonts w:ascii="Segoe UI" w:hAnsi="Segoe UI" w:cs="Segoe UI"/>
+                <w:b/>
+                <w:bCs/>
+                <w:lang w:val="en-US"/>
+              </w:rPr>
+            </w:pPr>
+            <w:r>
+              <w:rPr>
+                <w:rFonts w:ascii="Segoe UI" w:hAnsi="Segoe UI" w:cs="Segoe UI"/>
+                <w:b/>
+                <w:bCs/>
+                <w:lang w:val="en-US"/>
+              </w:rPr>
+              <w:t>Auth</w:t>
+            </w:r>
+          </w:p>
+        </w:tc>
+      </w:tr>
+      <w:tr>
+        <w:tc>
+          <w:tcPr>
+            <w:tcW w:w="1195" w:type="dxa"/>
+            <w:tcBorders>
+              <w:top w:val="double" w:sz="4" w:space="0" w:color="A5AB81" w:themeColor="accent3"/>
+            </w:tcBorders>
+          </w:tcPr>
+          <w:p>
+            <w:pPr>
+              <w:pStyle w:val="ListParagraph"/>
+              <w:ind w:left="0"/>
+              <w:rPr>
+                <w:rFonts w:ascii="Segoe UI" w:hAnsi="Segoe UI" w:cs="Segoe UI"/>
+                <w:lang w:val="en-US"/>
+              </w:rPr>
+            </w:pPr>
+            <w:r>
+              <w:rPr>
+                <w:rFonts w:ascii="Segoe UI" w:hAnsi="Segoe UI" w:cs="Segoe UI"/>
+                <w:lang w:val="en-US"/>
+              </w:rPr>
+              <w:t>GET</w:t>
+            </w:r>
+          </w:p>
+        </w:tc>
+        <w:tc>
+          <w:tcPr>
+            <w:tcW w:w="2409" w:type="dxa"/>
+            <w:tcBorders>
+              <w:top w:val="double" w:sz="4" w:space="0" w:color="A5AB81" w:themeColor="accent3"/>
+            </w:tcBorders>
+          </w:tcPr>
+          <w:p>
+            <w:pPr>
+              <w:pStyle w:val="ListParagraph"/>
+              <w:ind w:left="0"/>
+              <w:rPr>
+                <w:rFonts w:ascii="Segoe UI" w:hAnsi="Segoe UI" w:cs="Segoe UI"/>
+                <w:lang w:val="en-US"/>
+              </w:rPr>
+            </w:pPr>
+            <w:r>
+              <w:rPr>
+                <w:rFonts w:ascii="Segoe UI" w:hAnsi="Segoe UI" w:cs="Segoe UI"/>
+                <w:lang w:val="en-US"/>
+              </w:rPr>
+              <w:t>/</w:t>
+            </w:r>
+          </w:p>
+        </w:tc>
+        <w:tc>
+          <w:tcPr>
+            <w:tcW w:w="2958" w:type="dxa"/>
+            <w:tcBorders>
+              <w:top w:val="double" w:sz="4" w:space="0" w:color="A5AB81" w:themeColor="accent3"/>
+            </w:tcBorders>
+          </w:tcPr>
+          <w:p>
+            <w:pPr>
+              <w:pStyle w:val="ListParagraph"/>
+              <w:ind w:left="0"/>
+              <w:rPr>
+                <w:rFonts w:ascii="Segoe UI" w:hAnsi="Segoe UI" w:cs="Segoe UI"/>
+                <w:lang w:val="en-US"/>
+              </w:rPr>
+            </w:pPr>
+            <w:r>
+              <w:rPr>
+                <w:rFonts w:ascii="Segoe UI" w:hAnsi="Segoe UI" w:cs="Segoe UI"/>
+              </w:rPr>
+              <w:t>Dashboard (summary indicators)</w:t>
+            </w:r>
+          </w:p>
+        </w:tc>
+        <w:tc>
+          <w:tcPr>
+            <w:tcW w:w="2094" w:type="dxa"/>
+            <w:tcBorders>
+              <w:top w:val="double" w:sz="4" w:space="0" w:color="A5AB81" w:themeColor="accent3"/>
+            </w:tcBorders>
+          </w:tcPr>
+          <w:p>
+            <w:pPr>
+              <w:pStyle w:val="ListParagraph"/>
+              <w:ind w:left="0"/>
+              <w:rPr>
+                <w:rFonts w:ascii="Segoe UI" w:hAnsi="Segoe UI" w:cs="Segoe UI"/>
+                <w:lang w:val="en-US"/>
+              </w:rPr>
+            </w:pPr>
+            <w:r>
+              <w:rPr>
+                <w:rFonts w:ascii="Segoe UI" w:hAnsi="Segoe UI" w:cs="Segoe UI"/>
+                <w:lang w:val="en-US"/>
+              </w:rPr>
+              <w:t>Public</w:t>
+            </w:r>
+          </w:p>
+        </w:tc>
+      </w:tr>
+      <w:tr>
+        <w:tc>
+          <w:tcPr>
+            <w:tcW w:w="1195" w:type="dxa"/>
+          </w:tcPr>
+          <w:p>
+            <w:pPr>
+              <w:pStyle w:val="ListParagraph"/>
+              <w:ind w:left="0"/>
+              <w:rPr>
+                <w:rFonts w:ascii="Segoe UI" w:hAnsi="Segoe UI" w:cs="Segoe UI"/>
+                <w:lang w:val="en-US"/>
+              </w:rPr>
+            </w:pPr>
+            <w:r>
+              <w:rPr>
+                <w:rFonts w:ascii="Segoe UI" w:hAnsi="Segoe UI" w:cs="Segoe UI"/>
+                <w:lang w:val="en-US"/>
+              </w:rPr>
+              <w:t>GET</w:t>
+            </w:r>
+          </w:p>
+        </w:tc>
+        <w:tc>
+          <w:tcPr>
+            <w:tcW w:w="2409" w:type="dxa"/>
+          </w:tcPr>
+          <w:p>
+            <w:pPr>
+              <w:pStyle w:val="ListParagraph"/>
+              <w:ind w:left="0"/>
+              <w:rPr>
+                <w:rFonts w:ascii="Segoe UI" w:hAnsi="Segoe UI" w:cs="Segoe UI"/>
+                <w:lang w:val="en-US"/>
+              </w:rPr>
+            </w:pPr>
+            <w:r>
+              <w:rPr>
+                <w:rFonts w:ascii="Segoe UI" w:hAnsi="Segoe UI" w:cs="Segoe UI"/>
+                <w:lang w:val="en-US"/>
+              </w:rPr>
+              <w:t>/</w:t>
+            </w:r>
+            <w:proofErr w:type="gramStart"/>
+            <w:r>
+              <w:rPr>
+                <w:rFonts w:ascii="Segoe UI" w:hAnsi="Segoe UI" w:cs="Segoe UI"/>
+                <w:lang w:val="en-US"/>
+              </w:rPr>
+              <w:t>prices</w:t>
+            </w:r>
+            <w:proofErr w:type="gramEnd"/>
+          </w:p>
+        </w:tc>
+        <w:tc>
+          <w:tcPr>
+            <w:tcW w:w="2958" w:type="dxa"/>
+          </w:tcPr>
+          <w:p>
+            <w:pPr>
+              <w:pStyle w:val="ListParagraph"/>
+              <w:ind w:left="0"/>
+              <w:rPr>
+                <w:rFonts w:ascii="Segoe UI" w:hAnsi="Segoe UI" w:cs="Segoe UI"/>
+                <w:lang w:val="en-US"/>
+              </w:rPr>
+            </w:pPr>
+            <w:r>
+              <w:rPr>
+                <w:rFonts w:ascii="Segoe UI" w:hAnsi="Segoe UI" w:cs="Segoe UI"/>
+              </w:rPr>
+              <w:t>Search/list price records (query: market, commodity, from, to, page, sort)</w:t>
+            </w:r>
+          </w:p>
+        </w:tc>
+        <w:tc>
+          <w:tcPr>
+            <w:tcW w:w="2094" w:type="dxa"/>
+          </w:tcPr>
+          <w:p>
+            <w:pPr>
+              <w:pStyle w:val="ListParagraph"/>
+              <w:ind w:left="0"/>
+              <w:rPr>
+                <w:rFonts w:ascii="Segoe UI" w:hAnsi="Segoe UI" w:cs="Segoe UI"/>
+                <w:lang w:val="en-US"/>
+              </w:rPr>
+            </w:pPr>
+            <w:r>
+              <w:rPr>
+                <w:rFonts w:ascii="Segoe UI" w:hAnsi="Segoe UI" w:cs="Segoe UI"/>
+                <w:lang w:val="en-US"/>
+              </w:rPr>
+              <w:t>Public</w:t>
+            </w:r>
+          </w:p>
+        </w:tc>
+      </w:tr>
+      <w:tr>
+        <w:tc>
+          <w:tcPr>
+            <w:tcW w:w="1195" w:type="dxa"/>
+          </w:tcPr>
+          <w:p>
+            <w:pPr>
+              <w:pStyle w:val="ListParagraph"/>
+              <w:ind w:left="0"/>
+              <w:rPr>
+                <w:rFonts w:ascii="Segoe UI" w:hAnsi="Segoe UI" w:cs="Segoe UI"/>
+                <w:lang w:val="en-US"/>
+              </w:rPr>
+            </w:pPr>
+            <w:r>
+              <w:rPr>
+                <w:rFonts w:ascii="Segoe UI" w:hAnsi="Segoe UI" w:cs="Segoe UI"/>
+                <w:lang w:val="en-US"/>
+              </w:rPr>
+              <w:lastRenderedPageBreak/>
+              <w:t>GET</w:t>
+            </w:r>
+          </w:p>
+        </w:tc>
+        <w:tc>
+          <w:tcPr>
+            <w:tcW w:w="2409" w:type="dxa"/>
+          </w:tcPr>
+          <w:p>
+            <w:pPr>
+              <w:pStyle w:val="ListParagraph"/>
+              <w:ind w:left="0"/>
+              <w:rPr>
+                <w:rFonts w:ascii="Segoe UI" w:hAnsi="Segoe UI" w:cs="Segoe UI"/>
+                <w:lang w:val="en-US"/>
+              </w:rPr>
+            </w:pPr>
+            <w:r>
+              <w:rPr>
+                <w:rFonts w:ascii="Segoe UI" w:hAnsi="Segoe UI" w:cs="Segoe UI"/>
+                <w:lang w:val="en-US"/>
+              </w:rPr>
+              <w:t>/prices/{id}</w:t>
+            </w:r>
+          </w:p>
+        </w:tc>
+        <w:tc>
+          <w:tcPr>
+            <w:tcW w:w="2958" w:type="dxa"/>
+          </w:tcPr>
+          <w:p>
+            <w:pPr>
+              <w:pStyle w:val="ListParagraph"/>
+              <w:ind w:left="0"/>
+              <w:rPr>
+                <w:rFonts w:ascii="Segoe UI" w:hAnsi="Segoe UI" w:cs="Segoe UI"/>
+                <w:lang w:val="en-US"/>
+              </w:rPr>
+            </w:pPr>
+            <w:r>
+              <w:rPr>
+                <w:rFonts w:ascii="Segoe UI" w:hAnsi="Segoe UI" w:cs="Segoe UI"/>
+              </w:rPr>
+              <w:t>Single record detail (drill-down)</w:t>
+            </w:r>
+          </w:p>
+        </w:tc>
+        <w:tc>
+          <w:tcPr>
+            <w:tcW w:w="2094" w:type="dxa"/>
+          </w:tcPr>
+          <w:p>
+            <w:pPr>
+              <w:pStyle w:val="ListParagraph"/>
+              <w:ind w:left="0"/>
+              <w:rPr>
+                <w:rFonts w:ascii="Segoe UI" w:hAnsi="Segoe UI" w:cs="Segoe UI"/>
+                <w:lang w:val="en-US"/>
+              </w:rPr>
+            </w:pPr>
+            <w:r>
+              <w:rPr>
+                <w:rFonts w:ascii="Segoe UI" w:hAnsi="Segoe UI" w:cs="Segoe UI"/>
+                <w:lang w:val="en-US"/>
+              </w:rPr>
+              <w:t>Public</w:t>
+            </w:r>
+          </w:p>
+        </w:tc>
+      </w:tr>
+      <w:tr>
+        <w:tc>
+          <w:tcPr>
+            <w:tcW w:w="1195" w:type="dxa"/>
+          </w:tcPr>
+          <w:p>
+            <w:pPr>
+              <w:pStyle w:val="ListParagraph"/>
+              <w:ind w:left="0"/>
+              <w:rPr>
+                <w:rFonts w:ascii="Segoe UI" w:hAnsi="Segoe UI" w:cs="Segoe UI"/>
+                <w:lang w:val="en-US"/>
+              </w:rPr>
+            </w:pPr>
+            <w:r>
+              <w:rPr>
+                <w:rFonts w:ascii="Segoe UI" w:hAnsi="Segoe UI" w:cs="Segoe UI"/>
+                <w:lang w:val="en-US"/>
+              </w:rPr>
+              <w:t>POST</w:t>
+            </w:r>
+          </w:p>
+        </w:tc>
+        <w:tc>
+          <w:tcPr>
+            <w:tcW w:w="2409" w:type="dxa"/>
+          </w:tcPr>
+          <w:p>
+            <w:pPr>
+              <w:pStyle w:val="ListParagraph"/>
+              <w:ind w:left="0"/>
+              <w:rPr>
+                <w:rFonts w:ascii="Segoe UI" w:hAnsi="Segoe UI" w:cs="Segoe UI"/>
+                <w:lang w:val="en-US"/>
+              </w:rPr>
+            </w:pPr>
+            <w:r>
+              <w:rPr>
+                <w:rFonts w:ascii="Segoe UI" w:hAnsi="Segoe UI" w:cs="Segoe UI"/>
+                <w:lang w:val="en-US"/>
+              </w:rPr>
+              <w:t>/</w:t>
+            </w:r>
+            <w:proofErr w:type="gramStart"/>
+            <w:r>
+              <w:rPr>
+                <w:rFonts w:ascii="Segoe UI" w:hAnsi="Segoe UI" w:cs="Segoe UI"/>
+                <w:lang w:val="en-US"/>
+              </w:rPr>
+              <w:t>prices</w:t>
+            </w:r>
+            <w:proofErr w:type="gramEnd"/>
+          </w:p>
+        </w:tc>
+        <w:tc>
+          <w:tcPr>
+            <w:tcW w:w="2958" w:type="dxa"/>
+          </w:tcPr>
+          <w:p>
+            <w:pPr>
+              <w:pStyle w:val="ListParagraph"/>
+              <w:ind w:left="0"/>
+              <w:rPr>
+                <w:rFonts w:ascii="Segoe UI" w:hAnsi="Segoe UI" w:cs="Segoe UI"/>
+                <w:lang w:val="en-US"/>
+              </w:rPr>
+            </w:pPr>
+            <w:r>
+              <w:rPr>
+                <w:rFonts w:ascii="Segoe UI" w:hAnsi="Segoe UI" w:cs="Segoe UI"/>
+              </w:rPr>
+              <w:t>Create a price record</w:t>
+            </w:r>
+          </w:p>
+        </w:tc>
+        <w:tc>
+          <w:tcPr>
+            <w:tcW w:w="2094" w:type="dxa"/>
+          </w:tcPr>
+          <w:p>
+            <w:pPr>
+              <w:pStyle w:val="ListParagraph"/>
+              <w:ind w:left="0"/>
+              <w:rPr>
+                <w:rFonts w:ascii="Segoe UI" w:hAnsi="Segoe UI" w:cs="Segoe UI"/>
+                <w:lang w:val="en-US"/>
+              </w:rPr>
+            </w:pPr>
+            <w:r>
+              <w:rPr>
+                <w:rFonts w:ascii="Segoe UI" w:hAnsi="Segoe UI" w:cs="Segoe UI"/>
+                <w:lang w:val="en-US"/>
+              </w:rPr>
+              <w:t>Role: ENTRY_USER</w:t>
+            </w:r>
+          </w:p>
+        </w:tc>
+      </w:tr>
+      <w:tr>
+        <w:tc>
+          <w:tcPr>
+            <w:tcW w:w="1195" w:type="dxa"/>
+          </w:tcPr>
+          <w:p>
+            <w:pPr>
+              <w:pStyle w:val="ListParagraph"/>
+              <w:ind w:left="0"/>
+              <w:rPr>
+                <w:rFonts w:ascii="Segoe UI" w:hAnsi="Segoe UI" w:cs="Segoe UI"/>
+                <w:lang w:val="en-US"/>
+              </w:rPr>
+            </w:pPr>
+            <w:r>
+              <w:rPr>
+                <w:rFonts w:ascii="Segoe UI" w:hAnsi="Segoe UI" w:cs="Segoe UI"/>
+                <w:lang w:val="en-US"/>
+              </w:rPr>
+              <w:t>PUT</w:t>
+            </w:r>
+          </w:p>
+        </w:tc>
+        <w:tc>
+          <w:tcPr>
+            <w:tcW w:w="2409" w:type="dxa"/>
+          </w:tcPr>
+          <w:p>
+            <w:pPr>
+              <w:pStyle w:val="ListParagraph"/>
+              <w:ind w:left="0"/>
+              <w:rPr>
+                <w:rFonts w:ascii="Segoe UI" w:hAnsi="Segoe UI" w:cs="Segoe UI"/>
+                <w:lang w:val="en-US"/>
+              </w:rPr>
+            </w:pPr>
+            <w:r>
+              <w:rPr>
+                <w:rFonts w:ascii="Segoe UI" w:hAnsi="Segoe UI" w:cs="Segoe UI"/>
+                <w:lang w:val="en-US"/>
+              </w:rPr>
+              <w:t>/prices/{id}</w:t>
+            </w:r>
+          </w:p>
+        </w:tc>
+        <w:tc>
+          <w:tcPr>
+            <w:tcW w:w="2958" w:type="dxa"/>
+          </w:tcPr>
+          <w:p>
+            <w:pPr>
+              <w:pStyle w:val="ListParagraph"/>
+              <w:ind w:left="0"/>
+              <w:rPr>
+                <w:rFonts w:ascii="Segoe UI" w:hAnsi="Segoe UI" w:cs="Segoe UI"/>
+                <w:lang w:val="en-US"/>
+              </w:rPr>
+            </w:pPr>
+            <w:r>
+              <w:rPr>
+                <w:rFonts w:ascii="Segoe UI" w:hAnsi="Segoe UI" w:cs="Segoe UI"/>
+              </w:rPr>
+              <w:t>Edit a price record</w:t>
+            </w:r>
+          </w:p>
+        </w:tc>
+        <w:tc>
+          <w:tcPr>
+            <w:tcW w:w="2094" w:type="dxa"/>
+          </w:tcPr>
+          <w:p>
+            <w:pPr>
+              <w:pStyle w:val="ListParagraph"/>
+              <w:ind w:left="0"/>
+              <w:rPr>
+                <w:rFonts w:ascii="Segoe UI" w:hAnsi="Segoe UI" w:cs="Segoe UI"/>
+                <w:lang w:val="en-US"/>
+              </w:rPr>
+            </w:pPr>
+            <w:r>
+              <w:rPr>
+                <w:rFonts w:ascii="Segoe UI" w:hAnsi="Segoe UI" w:cs="Segoe UI"/>
+                <w:lang w:val="en-US"/>
+              </w:rPr>
+              <w:t>Role: ENTRY_USER</w:t>
+            </w:r>
+          </w:p>
+        </w:tc>
+      </w:tr>
+      <w:tr>
+        <w:tc>
+          <w:tcPr>
+            <w:tcW w:w="1195" w:type="dxa"/>
+          </w:tcPr>
+          <w:p>
+            <w:pPr>
+              <w:pStyle w:val="ListParagraph"/>
+              <w:ind w:left="0"/>
+              <w:rPr>
+                <w:rFonts w:ascii="Segoe UI" w:hAnsi="Segoe UI" w:cs="Segoe UI"/>
+                <w:lang w:val="en-US"/>
+              </w:rPr>
+            </w:pPr>
+            <w:r>
+              <w:rPr>
+                <w:rFonts w:ascii="Segoe UI" w:hAnsi="Segoe UI" w:cs="Segoe UI"/>
+                <w:lang w:val="en-US"/>
+              </w:rPr>
+              <w:t>GET</w:t>
+            </w:r>
+          </w:p>
+        </w:tc>
+        <w:tc>
+          <w:tcPr>
+            <w:tcW w:w="2409" w:type="dxa"/>
+          </w:tcPr>
+          <w:p>
+            <w:pPr>
+              <w:pStyle w:val="ListParagraph"/>
+              <w:ind w:left="0"/>
+              <w:rPr>
+                <w:rFonts w:ascii="Segoe UI" w:hAnsi="Segoe UI" w:cs="Segoe UI"/>
+                <w:lang w:val="en-US"/>
+              </w:rPr>
+            </w:pPr>
+            <w:r>
+              <w:rPr>
+                <w:rFonts w:ascii="Segoe UI" w:hAnsi="Segoe UI" w:cs="Segoe UI"/>
+                <w:lang w:val="en-US"/>
+              </w:rPr>
+              <w:t>/dashboard/summary</w:t>
+            </w:r>
+          </w:p>
+        </w:tc>
+        <w:tc>
+          <w:tcPr>
+            <w:tcW w:w="2958" w:type="dxa"/>
+          </w:tcPr>
+          <w:p>
+            <w:pPr>
+              <w:pStyle w:val="ListParagraph"/>
+              <w:ind w:left="0"/>
+              <w:rPr>
+                <w:rFonts w:ascii="Segoe UI" w:hAnsi="Segoe UI" w:cs="Segoe UI"/>
+                <w:lang w:val="en-US"/>
+              </w:rPr>
+            </w:pPr>
+            <w:r>
+              <w:rPr>
+                <w:rFonts w:ascii="Segoe UI" w:hAnsi="Segoe UI" w:cs="Segoe UI"/>
+              </w:rPr>
+              <w:t xml:space="preserve">JSON: </w:t>
+            </w:r>
+            <w:proofErr w:type="spellStart"/>
+            <w:r>
+              <w:rPr>
+                <w:rFonts w:ascii="Segoe UI" w:hAnsi="Segoe UI" w:cs="Segoe UI"/>
+              </w:rPr>
+              <w:t>avg</w:t>
+            </w:r>
+            <w:proofErr w:type="spellEnd"/>
+            <w:r>
+              <w:rPr>
+                <w:rFonts w:ascii="Segoe UI" w:hAnsi="Segoe UI" w:cs="Segoe UI"/>
+              </w:rPr>
+              <w:t>/modal price, % change, markets reporting</w:t>
+            </w:r>
+          </w:p>
+        </w:tc>
+        <w:tc>
+          <w:tcPr>
+            <w:tcW w:w="2094" w:type="dxa"/>
+          </w:tcPr>
+          <w:p>
+            <w:pPr>
+              <w:pStyle w:val="ListParagraph"/>
+              <w:ind w:left="0"/>
+              <w:rPr>
+                <w:rFonts w:ascii="Segoe UI" w:hAnsi="Segoe UI" w:cs="Segoe UI"/>
+                <w:lang w:val="en-US"/>
+              </w:rPr>
+            </w:pPr>
+            <w:r>
+              <w:rPr>
+                <w:rFonts w:ascii="Segoe UI" w:hAnsi="Segoe UI" w:cs="Segoe UI"/>
+                <w:lang w:val="en-US"/>
+              </w:rPr>
+              <w:t>Public</w:t>
+            </w:r>
+          </w:p>
+        </w:tc>
+      </w:tr>
+      <w:tr>
+        <w:tc>
+          <w:tcPr>
+            <w:tcW w:w="1195" w:type="dxa"/>
+          </w:tcPr>
+          <w:p>
+            <w:pPr>
+              <w:pStyle w:val="ListParagraph"/>
+              <w:ind w:left="0"/>
+              <w:rPr>
+                <w:rFonts w:ascii="Segoe UI" w:hAnsi="Segoe UI" w:cs="Segoe UI"/>
+                <w:lang w:val="en-US"/>
+              </w:rPr>
+            </w:pPr>
+            <w:r>
+              <w:rPr>
+                <w:rFonts w:ascii="Segoe UI" w:hAnsi="Segoe UI" w:cs="Segoe UI"/>
+                <w:lang w:val="en-US"/>
+              </w:rPr>
+              <w:t>GET</w:t>
+            </w:r>
+          </w:p>
+        </w:tc>
+        <w:tc>
+          <w:tcPr>
+            <w:tcW w:w="2409" w:type="dxa"/>
+          </w:tcPr>
+          <w:p>
+            <w:pPr>
+              <w:pStyle w:val="ListParagraph"/>
+              <w:ind w:left="0"/>
+              <w:rPr>
+                <w:rFonts w:ascii="Segoe UI" w:hAnsi="Segoe UI" w:cs="Segoe UI"/>
+                <w:lang w:val="en-US"/>
+              </w:rPr>
+            </w:pPr>
+            <w:r>
+              <w:rPr>
+                <w:rFonts w:ascii="Segoe UI" w:hAnsi="Segoe UI" w:cs="Segoe UI"/>
+                <w:lang w:val="en-US"/>
+              </w:rPr>
+              <w:t>/</w:t>
+            </w:r>
+            <w:proofErr w:type="gramStart"/>
+            <w:r>
+              <w:rPr>
+                <w:rFonts w:ascii="Segoe UI" w:hAnsi="Segoe UI" w:cs="Segoe UI"/>
+                <w:lang w:val="en-US"/>
+              </w:rPr>
+              <w:t>alerts</w:t>
+            </w:r>
+            <w:proofErr w:type="gramEnd"/>
+          </w:p>
+        </w:tc>
+        <w:tc>
+          <w:tcPr>
+            <w:tcW w:w="2958" w:type="dxa"/>
+          </w:tcPr>
+          <w:p>
+            <w:pPr>
+              <w:pStyle w:val="ListParagraph"/>
+              <w:ind w:left="0"/>
+              <w:rPr>
+                <w:rFonts w:ascii="Segoe UI" w:hAnsi="Segoe UI" w:cs="Segoe UI"/>
+                <w:lang w:val="en-US"/>
+              </w:rPr>
+            </w:pPr>
+            <w:r>
+              <w:rPr>
+                <w:rFonts w:ascii="Segoe UI" w:hAnsi="Segoe UI" w:cs="Segoe UI"/>
+              </w:rPr>
+              <w:t>List active alerts/exceptions</w:t>
+            </w:r>
+          </w:p>
+        </w:tc>
+        <w:tc>
+          <w:tcPr>
+            <w:tcW w:w="2094" w:type="dxa"/>
+          </w:tcPr>
+          <w:p>
+            <w:pPr>
+              <w:pStyle w:val="ListParagraph"/>
+              <w:ind w:left="0"/>
+              <w:rPr>
+                <w:rFonts w:ascii="Segoe UI" w:hAnsi="Segoe UI" w:cs="Segoe UI"/>
+                <w:lang w:val="en-US"/>
+              </w:rPr>
+            </w:pPr>
+            <w:r>
+              <w:rPr>
+                <w:rFonts w:ascii="Segoe UI" w:hAnsi="Segoe UI" w:cs="Segoe UI"/>
+                <w:lang w:val="en-US"/>
+              </w:rPr>
+              <w:t>Public</w:t>
+            </w:r>
+          </w:p>
+        </w:tc>
+      </w:tr>
+      <w:tr>
+        <w:tc>
+          <w:tcPr>
+            <w:tcW w:w="1195" w:type="dxa"/>
+          </w:tcPr>
+          <w:p>
+            <w:pPr>
+              <w:pStyle w:val="ListParagraph"/>
+              <w:ind w:left="0"/>
+              <w:rPr>
+                <w:rFonts w:ascii="Segoe UI" w:hAnsi="Segoe UI" w:cs="Segoe UI"/>
+                <w:lang w:val="en-US"/>
+              </w:rPr>
+            </w:pPr>
+            <w:r>
+              <w:rPr>
+                <w:rFonts w:ascii="Segoe UI" w:hAnsi="Segoe UI" w:cs="Segoe UI"/>
+                <w:lang w:val="en-US"/>
+              </w:rPr>
+              <w:t>GET</w:t>
+            </w:r>
+          </w:p>
+        </w:tc>
+        <w:tc>
+          <w:tcPr>
+            <w:tcW w:w="2409" w:type="dxa"/>
+          </w:tcPr>
+          <w:p>
+            <w:pPr>
+              <w:pStyle w:val="ListParagraph"/>
+              <w:ind w:left="0"/>
+              <w:rPr>
+                <w:rFonts w:ascii="Segoe UI" w:hAnsi="Segoe UI" w:cs="Segoe UI"/>
+                <w:lang w:val="en-US"/>
+              </w:rPr>
+            </w:pPr>
+            <w:r>
+              <w:rPr>
+                <w:rFonts w:ascii="Segoe UI" w:hAnsi="Segoe UI" w:cs="Segoe UI"/>
+                <w:lang w:val="en-US"/>
+              </w:rPr>
+              <w:t>/</w:t>
+            </w:r>
+            <w:proofErr w:type="gramStart"/>
+            <w:r>
+              <w:rPr>
+                <w:rFonts w:ascii="Segoe UI" w:hAnsi="Segoe UI" w:cs="Segoe UI"/>
+                <w:lang w:val="en-US"/>
+              </w:rPr>
+              <w:t>markets</w:t>
+            </w:r>
+            <w:proofErr w:type="gramEnd"/>
+          </w:p>
+        </w:tc>
+        <w:tc>
+          <w:tcPr>
+            <w:tcW w:w="2958" w:type="dxa"/>
+          </w:tcPr>
+          <w:p>
+            <w:pPr>
+              <w:pStyle w:val="ListParagraph"/>
+              <w:ind w:left="0"/>
+              <w:rPr>
+                <w:rFonts w:ascii="Segoe UI" w:hAnsi="Segoe UI" w:cs="Segoe UI"/>
+                <w:lang w:val="en-US"/>
+              </w:rPr>
+            </w:pPr>
+            <w:r>
+              <w:rPr>
+                <w:rFonts w:ascii="Segoe UI" w:hAnsi="Segoe UI" w:cs="Segoe UI"/>
+              </w:rPr>
+              <w:t>List markets (for form dropdowns)</w:t>
+            </w:r>
+          </w:p>
+        </w:tc>
+        <w:tc>
+          <w:tcPr>
+            <w:tcW w:w="2094" w:type="dxa"/>
+          </w:tcPr>
+          <w:p>
+            <w:pPr>
+              <w:pStyle w:val="ListParagraph"/>
+              <w:ind w:left="0"/>
+              <w:rPr>
+                <w:rFonts w:ascii="Segoe UI" w:hAnsi="Segoe UI" w:cs="Segoe UI"/>
+                <w:lang w:val="en-US"/>
+              </w:rPr>
+            </w:pPr>
+            <w:r>
+              <w:rPr>
+                <w:rFonts w:ascii="Segoe UI" w:hAnsi="Segoe UI" w:cs="Segoe UI"/>
+                <w:lang w:val="en-US"/>
+              </w:rPr>
+              <w:t>Public</w:t>
+            </w:r>
+          </w:p>
+        </w:tc>
+      </w:tr>
+      <w:tr>
+        <w:tc>
+          <w:tcPr>
+            <w:tcW w:w="1195" w:type="dxa"/>
+          </w:tcPr>
+          <w:p>
+            <w:pPr>
+              <w:pStyle w:val="ListParagraph"/>
+              <w:ind w:left="0"/>
+              <w:rPr>
+                <w:rFonts w:ascii="Segoe UI" w:hAnsi="Segoe UI" w:cs="Segoe UI"/>
+                <w:lang w:val="en-US"/>
+              </w:rPr>
+            </w:pPr>
+            <w:r>
+              <w:rPr>
+                <w:rFonts w:ascii="Segoe UI" w:hAnsi="Segoe UI" w:cs="Segoe UI"/>
+                <w:lang w:val="en-US"/>
+              </w:rPr>
+              <w:t>GET</w:t>
+            </w:r>
+          </w:p>
+        </w:tc>
+        <w:tc>
+          <w:tcPr>
+            <w:tcW w:w="2409" w:type="dxa"/>
+          </w:tcPr>
+          <w:p>
+            <w:pPr>
+              <w:pStyle w:val="ListParagraph"/>
+              <w:ind w:left="0"/>
+              <w:rPr>
+                <w:rFonts w:ascii="Segoe UI" w:hAnsi="Segoe UI" w:cs="Segoe UI"/>
+                <w:lang w:val="en-US"/>
+              </w:rPr>
+            </w:pPr>
+            <w:r>
+              <w:rPr>
+                <w:rFonts w:ascii="Segoe UI" w:hAnsi="Segoe UI" w:cs="Segoe UI"/>
+                <w:lang w:val="en-US"/>
+              </w:rPr>
+              <w:t>/</w:t>
+            </w:r>
+            <w:proofErr w:type="gramStart"/>
+            <w:r>
+              <w:rPr>
+                <w:rFonts w:ascii="Segoe UI" w:hAnsi="Segoe UI" w:cs="Segoe UI"/>
+                <w:lang w:val="en-US"/>
+              </w:rPr>
+              <w:t>commodities</w:t>
+            </w:r>
+            <w:proofErr w:type="gramEnd"/>
+          </w:p>
+        </w:tc>
+        <w:tc>
+          <w:tcPr>
+            <w:tcW w:w="2958" w:type="dxa"/>
+          </w:tcPr>
+          <w:p>
+            <w:pPr>
+              <w:pStyle w:val="ListParagraph"/>
+              <w:ind w:left="0"/>
+              <w:rPr>
+                <w:rFonts w:ascii="Segoe UI" w:hAnsi="Segoe UI" w:cs="Segoe UI"/>
+                <w:lang w:val="en-US"/>
+              </w:rPr>
+            </w:pPr>
+            <w:r>
+              <w:rPr>
+                <w:rFonts w:ascii="Segoe UI" w:hAnsi="Segoe UI" w:cs="Segoe UI"/>
+              </w:rPr>
+              <w:t>List commodities (for form dropdowns)</w:t>
+            </w:r>
+          </w:p>
+        </w:tc>
+        <w:tc>
+          <w:tcPr>
+            <w:tcW w:w="2094" w:type="dxa"/>
+          </w:tcPr>
+          <w:p>
+            <w:pPr>
+              <w:pStyle w:val="ListParagraph"/>
+              <w:ind w:left="0"/>
+              <w:rPr>
+                <w:rFonts w:ascii="Segoe UI" w:hAnsi="Segoe UI" w:cs="Segoe UI"/>
+                <w:lang w:val="en-US"/>
+              </w:rPr>
+            </w:pPr>
+            <w:r>
+              <w:rPr>
+                <w:rFonts w:ascii="Segoe UI" w:hAnsi="Segoe UI" w:cs="Segoe UI"/>
+                <w:lang w:val="en-US"/>
+              </w:rPr>
+              <w:t>Public</w:t>
+            </w:r>
+          </w:p>
+        </w:tc>
+      </w:tr>
+      <w:tr>
+        <w:tc>
+          <w:tcPr>
+            <w:tcW w:w="1195" w:type="dxa"/>
+          </w:tcPr>
+          <w:p>
+            <w:pPr>
+              <w:pStyle w:val="ListParagraph"/>
+              <w:ind w:left="0"/>
+              <w:rPr>
+                <w:rFonts w:ascii="Segoe UI" w:hAnsi="Segoe UI" w:cs="Segoe UI"/>
+                <w:lang w:val="en-US"/>
+              </w:rPr>
+            </w:pPr>
+            <w:r>
+              <w:rPr>
+                <w:rFonts w:ascii="Segoe UI" w:hAnsi="Segoe UI" w:cs="Segoe UI"/>
+                <w:lang w:val="en-US"/>
+              </w:rPr>
+              <w:t>GET</w:t>
+            </w:r>
+          </w:p>
+        </w:tc>
+        <w:tc>
+          <w:tcPr>
+            <w:tcW w:w="2409" w:type="dxa"/>
+          </w:tcPr>
+          <w:p>
+            <w:pPr>
+              <w:pStyle w:val="ListParagraph"/>
+              <w:ind w:left="0"/>
+              <w:rPr>
+                <w:rFonts w:ascii="Segoe UI" w:hAnsi="Segoe UI" w:cs="Segoe UI"/>
+                <w:lang w:val="en-US"/>
+              </w:rPr>
+            </w:pPr>
+            <w:r>
+              <w:rPr>
+                <w:rFonts w:ascii="Segoe UI" w:hAnsi="Segoe UI" w:cs="Segoe UI"/>
+                <w:lang w:val="en-US"/>
+              </w:rPr>
+              <w:t>/actuator/health</w:t>
+            </w:r>
+          </w:p>
+        </w:tc>
+        <w:tc>
+          <w:tcPr>
+            <w:tcW w:w="2958" w:type="dxa"/>
+          </w:tcPr>
+          <w:p>
+            <w:pPr>
+              <w:pStyle w:val="ListParagraph"/>
+              <w:ind w:left="0"/>
+              <w:rPr>
+                <w:rFonts w:ascii="Segoe UI" w:hAnsi="Segoe UI" w:cs="Segoe UI"/>
+                <w:lang w:val="en-US"/>
+              </w:rPr>
+            </w:pPr>
+            <w:r>
+              <w:rPr>
+                <w:rFonts w:ascii="Segoe UI" w:hAnsi="Segoe UI" w:cs="Segoe UI"/>
+              </w:rPr>
+              <w:t>Health check (used by Ansible/monitoring in Task 14)</w:t>
+            </w:r>
+          </w:p>
+        </w:tc>
+        <w:tc>
+          <w:tcPr>
+            <w:tcW w:w="2094" w:type="dxa"/>
+          </w:tcPr>
+          <w:p>
+            <w:pPr>
+              <w:pStyle w:val="ListParagraph"/>
+              <w:ind w:left="0"/>
+              <w:rPr>
+                <w:rFonts w:ascii="Segoe UI" w:hAnsi="Segoe UI" w:cs="Segoe UI"/>
+                <w:lang w:val="en-US"/>
+              </w:rPr>
+            </w:pPr>
+            <w:r>
+              <w:rPr>
+                <w:rFonts w:ascii="Segoe UI" w:hAnsi="Segoe UI" w:cs="Segoe UI"/>
+                <w:lang w:val="en-US"/>
+              </w:rPr>
+              <w:t>Public</w:t>
+            </w:r>
+          </w:p>
+        </w:tc>
+      </w:tr>
+    </w:tbl>
+    <w:p>
+      <w:pPr>
+        <w:pStyle w:val="ListParagraph"/>
+        <w:ind w:left="360"/>
+        <w:jc w:val="both"/>
+        <w:rPr>
+          <w:rFonts w:ascii="Segoe UI" w:hAnsi="Segoe UI" w:cs="Segoe UI"/>
+          <w:b/>
+          <w:bCs/>
+          <w:lang w:val="en-US"/>
+        </w:rPr>
+      </w:pPr>
     </w:p>
     <w:p>
       <w:pPr>
@@ -3053,19 +4461,86 @@
         <w:jc w:val="both"/>
         <w:rPr>
           <w:rFonts w:ascii="Segoe UI" w:hAnsi="Segoe UI" w:cs="Segoe UI"/>
+          <w:b/>
+          <w:bCs/>
           <w:lang w:val="en-US"/>
         </w:rPr>
       </w:pPr>
       <w:r>
         <w:rPr>
           <w:rFonts w:ascii="Segoe UI" w:hAnsi="Segoe UI" w:cs="Segoe UI"/>
+          <w:b/>
+          <w:bCs/>
           <w:lang w:val="en-US"/>
         </w:rPr>
         <w:t>Local Development Setup</w:t>
       </w:r>
     </w:p>
+    <w:p>
+      <w:pPr>
+        <w:pStyle w:val="ListParagraph"/>
+        <w:ind w:left="360"/>
+        <w:jc w:val="center"/>
+        <w:rPr>
+          <w:rFonts w:ascii="Segoe UI" w:hAnsi="Segoe UI" w:cs="Segoe UI"/>
+          <w:b/>
+          <w:bCs/>
+          <w:lang w:val="en-US"/>
+        </w:rPr>
+      </w:pPr>
+      <w:r>
+        <w:rPr>
+          <w:rFonts w:ascii="Segoe UI" w:hAnsi="Segoe UI" w:cs="Segoe UI"/>
+          <w:b/>
+          <w:bCs/>
+          <w:noProof/>
+          <w:lang w:val="en-US"/>
+        </w:rPr>
+        <w:drawing>
+          <wp:inline distT="0" distB="0" distL="0" distR="0" wp14:anchorId="6C329915" wp14:editId="12467B43">
+            <wp:extent cx="5111305" cy="3014345"/>
+            <wp:effectExtent l="0" t="0" r="0" b="0"/>
+            <wp:docPr id="2090819226" name="Picture 7"/>
+            <wp:cNvGraphicFramePr>
+              <a:graphicFrameLocks xmlns:a="http://schemas.openxmlformats.org/drawingml/2006/main" noChangeAspect="1"/>
+            </wp:cNvGraphicFramePr>
+            <a:graphic xmlns:a="http://schemas.openxmlformats.org/drawingml/2006/main">
+              <a:graphicData uri="http://schemas.openxmlformats.org/drawingml/2006/picture">
+                <pic:pic xmlns:pic="http://schemas.openxmlformats.org/drawingml/2006/picture">
+                  <pic:nvPicPr>
+                    <pic:cNvPr id="2090819226" name="Picture 2090819226"/>
+                    <pic:cNvPicPr/>
+                  </pic:nvPicPr>
+                  <pic:blipFill>
+                    <a:blip r:embed="rId13">
+                      <a:extLst>
+                        <a:ext uri="{28A0092B-C50C-407E-A947-70E740481C1C}">
+                          <a14:useLocalDpi xmlns:a14="http://schemas.microsoft.com/office/drawing/2010/main" val="0"/>
+                        </a:ext>
+                      </a:extLst>
+                    </a:blip>
+                    <a:stretch>
+                      <a:fillRect/>
+                    </a:stretch>
+                  </pic:blipFill>
+                  <pic:spPr>
+                    <a:xfrm>
+                      <a:off x="0" y="0"/>
+                      <a:ext cx="5114482" cy="3016219"/>
+                    </a:xfrm>
+                    <a:prstGeom prst="rect">
+                      <a:avLst/>
+                    </a:prstGeom>
+                  </pic:spPr>
+                </pic:pic>
+              </a:graphicData>
+            </a:graphic>
+          </wp:inline>
+        </w:drawing>
+      </w:r>
+    </w:p>
     <w:sectPr>
-      <w:headerReference w:type="default" r:id="rId10"/>
+      <w:headerReference w:type="default" r:id="rId14"/>
       <w:pgSz w:w="11906" w:h="16838"/>
       <w:pgMar w:top="1440" w:right="1440" w:bottom="1440" w:left="1440" w:header="708" w:footer="708" w:gutter="0"/>
       <w:cols w:space="708"/>

</xml_diff>